<commit_message>
Please provide the changes or the file diffs you would like me to summarize.
</commit_message>
<xml_diff>
--- a/backend-app/samples/biểu mẫu tiệc/BIÊN BẢN GIAO MÓN PHÁT SINH.docx
+++ b/backend-app/samples/biểu mẫu tiệc/BIÊN BẢN GIAO MÓN PHÁT SINH.docx
@@ -877,23 +877,7 @@
             <w:tcW w:w="1361" w:type="dxa"/>
           </w:tcPr>
           <w:p>
-            <w:pPr>
-              <w:spacing w:before="60"/>
-              <w:jc w:val="center"/>
-              <w:rPr>
-                <w:rFonts w:ascii="Times New Roman" w:hAnsi="Times New Roman" w:cs="Times New Roman"/>
-                <w:b/>
-                <w:sz w:val="20"/>
-                <w:szCs w:val="20"/>
-              </w:rPr>
-            </w:pPr>
-            <w:r>
-              <w:rPr>
-                <w:rFonts w:ascii="Times New Roman" w:hAnsi="Times New Roman" w:cs="Times New Roman"/>
-                <w:b/>
-                <w:sz w:val="20"/>
-                <w:szCs w:val="20"/>
-              </w:rPr>
+            <w:r>
               <w:t>Số lượng</w:t>
             </w:r>
           </w:p>
@@ -903,16 +887,9 @@
             <w:tcW w:w="1605" w:type="dxa"/>
           </w:tcPr>
           <w:p>
-            <w:pPr>
-              <w:spacing w:before="60"/>
-              <w:jc w:val="right"/>
-              <w:rPr>
-                <w:rFonts w:ascii="Times New Roman" w:hAnsi="Times New Roman" w:cs="Times New Roman"/>
-                <w:b/>
-                <w:sz w:val="18"/>
-                <w:szCs w:val="18"/>
-              </w:rPr>
-            </w:pPr>
+            <w:r>
+              <w:t>{BanChinhThuc}</w:t>
+            </w:r>
           </w:p>
         </w:tc>
         <w:tc>
@@ -920,16 +897,9 @@
             <w:tcW w:w="1261" w:type="dxa"/>
           </w:tcPr>
           <w:p>
-            <w:pPr>
-              <w:spacing w:before="60"/>
-              <w:jc w:val="right"/>
-              <w:rPr>
-                <w:rFonts w:ascii="Times New Roman" w:hAnsi="Times New Roman" w:cs="Times New Roman"/>
-                <w:b/>
-                <w:sz w:val="18"/>
-                <w:szCs w:val="18"/>
-              </w:rPr>
-            </w:pPr>
+            <w:r>
+              <w:t>{BanTang}</w:t>
+            </w:r>
           </w:p>
         </w:tc>
         <w:tc>
@@ -937,16 +907,9 @@
             <w:tcW w:w="1472" w:type="dxa"/>
           </w:tcPr>
           <w:p>
-            <w:pPr>
-              <w:spacing w:before="60"/>
-              <w:jc w:val="right"/>
-              <w:rPr>
-                <w:rFonts w:ascii="Times New Roman" w:hAnsi="Times New Roman" w:cs="Times New Roman"/>
-                <w:b/>
-                <w:sz w:val="18"/>
-                <w:szCs w:val="18"/>
-              </w:rPr>
-            </w:pPr>
+            <w:r>
+              <w:t>{BanChay}</w:t>
+            </w:r>
           </w:p>
         </w:tc>
         <w:tc>
@@ -954,16 +917,9 @@
             <w:tcW w:w="1490" w:type="dxa"/>
           </w:tcPr>
           <w:p>
-            <w:pPr>
-              <w:spacing w:before="60"/>
-              <w:jc w:val="right"/>
-              <w:rPr>
-                <w:rFonts w:ascii="Times New Roman" w:hAnsi="Times New Roman" w:cs="Times New Roman"/>
-                <w:b/>
-                <w:sz w:val="18"/>
-                <w:szCs w:val="18"/>
-              </w:rPr>
-            </w:pPr>
+            <w:r>
+              <w:t>{BanDuPhong}</w:t>
+            </w:r>
           </w:p>
         </w:tc>
         <w:tc>
@@ -971,17 +927,9 @@
             <w:tcW w:w="1863" w:type="dxa"/>
           </w:tcPr>
           <w:p>
-            <w:pPr>
-              <w:spacing w:before="60"/>
-              <w:ind w:right="1739"/>
-              <w:jc w:val="right"/>
-              <w:rPr>
-                <w:rFonts w:ascii="Times New Roman" w:hAnsi="Times New Roman" w:cs="Times New Roman"/>
-                <w:b/>
-                <w:sz w:val="18"/>
-                <w:szCs w:val="18"/>
-              </w:rPr>
-            </w:pPr>
+            <w:r>
+              <w:t>{BanPhatSinh}</w:t>
+            </w:r>
           </w:p>
         </w:tc>
         <w:tc>
@@ -989,17 +937,9 @@
             <w:tcW w:w="1964" w:type="dxa"/>
           </w:tcPr>
           <w:p>
-            <w:pPr>
-              <w:spacing w:before="60"/>
-              <w:ind w:right="1739"/>
-              <w:jc w:val="right"/>
-              <w:rPr>
-                <w:rFonts w:ascii="Times New Roman" w:hAnsi="Times New Roman" w:cs="Times New Roman"/>
-                <w:b/>
-                <w:sz w:val="18"/>
-                <w:szCs w:val="18"/>
-              </w:rPr>
-            </w:pPr>
+            <w:r>
+              <w:t>{TongSoBan}</w:t>
+            </w:r>
           </w:p>
         </w:tc>
       </w:tr>
@@ -1201,21 +1141,8 @@
             <w:tcW w:w="650" w:type="dxa"/>
           </w:tcPr>
           <w:p>
-            <w:pPr>
-              <w:jc w:val="center"/>
-              <w:rPr>
-                <w:rFonts w:ascii="Times New Roman" w:hAnsi="Times New Roman" w:cs="Times New Roman"/>
-                <w:sz w:val="20"/>
-                <w:szCs w:val="20"/>
-              </w:rPr>
-            </w:pPr>
-            <w:r>
-              <w:rPr>
-                <w:rFonts w:ascii="Times New Roman" w:hAnsi="Times New Roman" w:cs="Times New Roman"/>
-                <w:sz w:val="20"/>
-                <w:szCs w:val="20"/>
-              </w:rPr>
-              <w:t>1</w:t>
+            <w:r>
+              <w:t>{#MenuPhatSinh}{STT}</w:t>
             </w:r>
           </w:p>
         </w:tc>
@@ -1224,13 +1151,9 @@
             <w:tcW w:w="3707" w:type="dxa"/>
           </w:tcPr>
           <w:p>
-            <w:pPr>
-              <w:rPr>
-                <w:rFonts w:ascii="Times New Roman" w:hAnsi="Times New Roman" w:cs="Times New Roman"/>
-                <w:sz w:val="20"/>
-                <w:szCs w:val="20"/>
-              </w:rPr>
-            </w:pPr>
+            <w:r>
+              <w:t>{MonMan}</w:t>
+            </w:r>
           </w:p>
         </w:tc>
         <w:tc>
@@ -1238,13 +1161,9 @@
             <w:tcW w:w="3127" w:type="dxa"/>
           </w:tcPr>
           <w:p>
-            <w:pPr>
-              <w:rPr>
-                <w:rFonts w:ascii="Times New Roman" w:hAnsi="Times New Roman" w:cs="Times New Roman"/>
-                <w:sz w:val="20"/>
-                <w:szCs w:val="20"/>
-              </w:rPr>
-            </w:pPr>
+            <w:r>
+              <w:t>{MonChay}</w:t>
+            </w:r>
           </w:p>
         </w:tc>
         <w:tc>
@@ -1252,645 +1171,9 @@
             <w:tcW w:w="3153" w:type="dxa"/>
           </w:tcPr>
           <w:p>
-            <w:pPr>
-              <w:rPr>
-                <w:rFonts w:ascii="Times New Roman" w:hAnsi="Times New Roman" w:cs="Times New Roman"/>
-                <w:sz w:val="20"/>
-                <w:szCs w:val="20"/>
-              </w:rPr>
-            </w:pPr>
-          </w:p>
-        </w:tc>
-      </w:tr>
-      <w:tr>
-        <w:trPr>
-          <w:trHeight w:val="543"/>
-        </w:trPr>
-        <w:tc>
-          <w:tcPr>
-            <w:tcW w:w="650" w:type="dxa"/>
-          </w:tcPr>
-          <w:p>
-            <w:pPr>
-              <w:jc w:val="center"/>
-              <w:rPr>
-                <w:rFonts w:ascii="Times New Roman" w:hAnsi="Times New Roman" w:cs="Times New Roman"/>
-                <w:sz w:val="20"/>
-                <w:szCs w:val="20"/>
-              </w:rPr>
-            </w:pPr>
-            <w:r>
-              <w:rPr>
-                <w:rFonts w:ascii="Times New Roman" w:hAnsi="Times New Roman" w:cs="Times New Roman"/>
-                <w:sz w:val="20"/>
-                <w:szCs w:val="20"/>
-              </w:rPr>
-              <w:t>2</w:t>
-            </w:r>
-          </w:p>
-        </w:tc>
-        <w:tc>
-          <w:tcPr>
-            <w:tcW w:w="3707" w:type="dxa"/>
-          </w:tcPr>
-          <w:p>
-            <w:pPr>
-              <w:rPr>
-                <w:rFonts w:ascii="Times New Roman" w:hAnsi="Times New Roman" w:cs="Times New Roman"/>
-                <w:sz w:val="20"/>
-                <w:szCs w:val="20"/>
-              </w:rPr>
-            </w:pPr>
-          </w:p>
-        </w:tc>
-        <w:tc>
-          <w:tcPr>
-            <w:tcW w:w="3127" w:type="dxa"/>
-          </w:tcPr>
-          <w:p>
-            <w:pPr>
-              <w:rPr>
-                <w:rFonts w:ascii="Times New Roman" w:hAnsi="Times New Roman" w:cs="Times New Roman"/>
-                <w:sz w:val="20"/>
-                <w:szCs w:val="20"/>
-              </w:rPr>
-            </w:pPr>
-          </w:p>
-        </w:tc>
-        <w:tc>
-          <w:tcPr>
-            <w:tcW w:w="3153" w:type="dxa"/>
-          </w:tcPr>
-          <w:p>
-            <w:pPr>
-              <w:rPr>
-                <w:rFonts w:ascii="Times New Roman" w:hAnsi="Times New Roman" w:cs="Times New Roman"/>
-                <w:sz w:val="20"/>
-                <w:szCs w:val="20"/>
-              </w:rPr>
-            </w:pPr>
-          </w:p>
-        </w:tc>
-      </w:tr>
-      <w:tr>
-        <w:trPr>
-          <w:trHeight w:val="525"/>
-        </w:trPr>
-        <w:tc>
-          <w:tcPr>
-            <w:tcW w:w="650" w:type="dxa"/>
-          </w:tcPr>
-          <w:p>
-            <w:pPr>
-              <w:jc w:val="center"/>
-              <w:rPr>
-                <w:rFonts w:ascii="Times New Roman" w:hAnsi="Times New Roman" w:cs="Times New Roman"/>
-                <w:sz w:val="20"/>
-                <w:szCs w:val="20"/>
-              </w:rPr>
-            </w:pPr>
-            <w:r>
-              <w:rPr>
-                <w:rFonts w:ascii="Times New Roman" w:hAnsi="Times New Roman" w:cs="Times New Roman"/>
-                <w:sz w:val="20"/>
-                <w:szCs w:val="20"/>
-              </w:rPr>
-              <w:t>3</w:t>
-            </w:r>
-          </w:p>
-        </w:tc>
-        <w:tc>
-          <w:tcPr>
-            <w:tcW w:w="3707" w:type="dxa"/>
-          </w:tcPr>
-          <w:p>
-            <w:pPr>
-              <w:rPr>
-                <w:rFonts w:ascii="Times New Roman" w:hAnsi="Times New Roman" w:cs="Times New Roman"/>
-                <w:sz w:val="20"/>
-                <w:szCs w:val="20"/>
-              </w:rPr>
-            </w:pPr>
-          </w:p>
-        </w:tc>
-        <w:tc>
-          <w:tcPr>
-            <w:tcW w:w="3127" w:type="dxa"/>
-          </w:tcPr>
-          <w:p>
-            <w:pPr>
-              <w:rPr>
-                <w:rFonts w:ascii="Times New Roman" w:hAnsi="Times New Roman" w:cs="Times New Roman"/>
-                <w:sz w:val="20"/>
-                <w:szCs w:val="20"/>
-              </w:rPr>
-            </w:pPr>
-          </w:p>
-        </w:tc>
-        <w:tc>
-          <w:tcPr>
-            <w:tcW w:w="3153" w:type="dxa"/>
-          </w:tcPr>
-          <w:p>
-            <w:pPr>
-              <w:rPr>
-                <w:rFonts w:ascii="Times New Roman" w:hAnsi="Times New Roman" w:cs="Times New Roman"/>
-                <w:sz w:val="20"/>
-                <w:szCs w:val="20"/>
-              </w:rPr>
-            </w:pPr>
-          </w:p>
-        </w:tc>
-      </w:tr>
-      <w:tr>
-        <w:trPr>
-          <w:trHeight w:val="525"/>
-        </w:trPr>
-        <w:tc>
-          <w:tcPr>
-            <w:tcW w:w="650" w:type="dxa"/>
-          </w:tcPr>
-          <w:p>
-            <w:pPr>
-              <w:jc w:val="center"/>
-              <w:rPr>
-                <w:rFonts w:ascii="Times New Roman" w:hAnsi="Times New Roman" w:cs="Times New Roman"/>
-                <w:sz w:val="20"/>
-                <w:szCs w:val="20"/>
-              </w:rPr>
-            </w:pPr>
-            <w:r>
-              <w:rPr>
-                <w:rFonts w:ascii="Times New Roman" w:hAnsi="Times New Roman" w:cs="Times New Roman"/>
-                <w:sz w:val="20"/>
-                <w:szCs w:val="20"/>
-              </w:rPr>
-              <w:t>4</w:t>
-            </w:r>
-          </w:p>
-        </w:tc>
-        <w:tc>
-          <w:tcPr>
-            <w:tcW w:w="3707" w:type="dxa"/>
-          </w:tcPr>
-          <w:p>
-            <w:pPr>
-              <w:rPr>
-                <w:rFonts w:ascii="Times New Roman" w:hAnsi="Times New Roman" w:cs="Times New Roman"/>
-                <w:sz w:val="20"/>
-                <w:szCs w:val="20"/>
-              </w:rPr>
-            </w:pPr>
-          </w:p>
-        </w:tc>
-        <w:tc>
-          <w:tcPr>
-            <w:tcW w:w="3127" w:type="dxa"/>
-          </w:tcPr>
-          <w:p>
-            <w:pPr>
-              <w:rPr>
-                <w:rFonts w:ascii="Times New Roman" w:hAnsi="Times New Roman" w:cs="Times New Roman"/>
-                <w:sz w:val="20"/>
-                <w:szCs w:val="20"/>
-              </w:rPr>
-            </w:pPr>
-          </w:p>
-        </w:tc>
-        <w:tc>
-          <w:tcPr>
-            <w:tcW w:w="3153" w:type="dxa"/>
-          </w:tcPr>
-          <w:p>
-            <w:pPr>
-              <w:rPr>
-                <w:rFonts w:ascii="Times New Roman" w:hAnsi="Times New Roman" w:cs="Times New Roman"/>
-                <w:sz w:val="20"/>
-                <w:szCs w:val="20"/>
-              </w:rPr>
-            </w:pPr>
-          </w:p>
-        </w:tc>
-      </w:tr>
-      <w:tr>
-        <w:trPr>
-          <w:trHeight w:val="615"/>
-        </w:trPr>
-        <w:tc>
-          <w:tcPr>
-            <w:tcW w:w="650" w:type="dxa"/>
-          </w:tcPr>
-          <w:p>
-            <w:pPr>
-              <w:jc w:val="center"/>
-              <w:rPr>
-                <w:rFonts w:ascii="Times New Roman" w:hAnsi="Times New Roman" w:cs="Times New Roman"/>
-                <w:sz w:val="20"/>
-                <w:szCs w:val="20"/>
-              </w:rPr>
-            </w:pPr>
-            <w:r>
-              <w:rPr>
-                <w:rFonts w:ascii="Times New Roman" w:hAnsi="Times New Roman" w:cs="Times New Roman"/>
-                <w:sz w:val="20"/>
-                <w:szCs w:val="20"/>
-              </w:rPr>
-              <w:t>5</w:t>
-            </w:r>
-          </w:p>
-        </w:tc>
-        <w:tc>
-          <w:tcPr>
-            <w:tcW w:w="3707" w:type="dxa"/>
-          </w:tcPr>
-          <w:p>
-            <w:pPr>
-              <w:rPr>
-                <w:rFonts w:ascii="Times New Roman" w:hAnsi="Times New Roman" w:cs="Times New Roman"/>
-                <w:sz w:val="20"/>
-                <w:szCs w:val="20"/>
-              </w:rPr>
-            </w:pPr>
-          </w:p>
-        </w:tc>
-        <w:tc>
-          <w:tcPr>
-            <w:tcW w:w="3127" w:type="dxa"/>
-          </w:tcPr>
-          <w:p>
-            <w:pPr>
-              <w:rPr>
-                <w:rFonts w:ascii="Times New Roman" w:hAnsi="Times New Roman" w:cs="Times New Roman"/>
-                <w:sz w:val="20"/>
-                <w:szCs w:val="20"/>
-              </w:rPr>
-            </w:pPr>
-          </w:p>
-        </w:tc>
-        <w:tc>
-          <w:tcPr>
-            <w:tcW w:w="3153" w:type="dxa"/>
-          </w:tcPr>
-          <w:p>
-            <w:pPr>
-              <w:rPr>
-                <w:rFonts w:ascii="Times New Roman" w:hAnsi="Times New Roman" w:cs="Times New Roman"/>
-                <w:sz w:val="20"/>
-                <w:szCs w:val="20"/>
-              </w:rPr>
-            </w:pPr>
-          </w:p>
-        </w:tc>
-      </w:tr>
-      <w:tr>
-        <w:trPr>
-          <w:trHeight w:val="543"/>
-        </w:trPr>
-        <w:tc>
-          <w:tcPr>
-            <w:tcW w:w="650" w:type="dxa"/>
-          </w:tcPr>
-          <w:p>
-            <w:pPr>
-              <w:jc w:val="center"/>
-              <w:rPr>
-                <w:rFonts w:ascii="Times New Roman" w:hAnsi="Times New Roman" w:cs="Times New Roman"/>
-                <w:sz w:val="20"/>
-                <w:szCs w:val="20"/>
-              </w:rPr>
-            </w:pPr>
-            <w:r>
-              <w:rPr>
-                <w:rFonts w:ascii="Times New Roman" w:hAnsi="Times New Roman" w:cs="Times New Roman"/>
-                <w:sz w:val="20"/>
-                <w:szCs w:val="20"/>
-              </w:rPr>
-              <w:t>6</w:t>
-            </w:r>
-          </w:p>
-        </w:tc>
-        <w:tc>
-          <w:tcPr>
-            <w:tcW w:w="3707" w:type="dxa"/>
-          </w:tcPr>
-          <w:p>
-            <w:pPr>
-              <w:rPr>
-                <w:rFonts w:ascii="Times New Roman" w:hAnsi="Times New Roman" w:cs="Times New Roman"/>
-                <w:sz w:val="20"/>
-                <w:szCs w:val="20"/>
-              </w:rPr>
-            </w:pPr>
-          </w:p>
-        </w:tc>
-        <w:tc>
-          <w:tcPr>
-            <w:tcW w:w="3127" w:type="dxa"/>
-          </w:tcPr>
-          <w:p>
-            <w:pPr>
-              <w:rPr>
-                <w:rFonts w:ascii="Times New Roman" w:hAnsi="Times New Roman" w:cs="Times New Roman"/>
-                <w:sz w:val="20"/>
-                <w:szCs w:val="20"/>
-              </w:rPr>
-            </w:pPr>
-          </w:p>
-        </w:tc>
-        <w:tc>
-          <w:tcPr>
-            <w:tcW w:w="3153" w:type="dxa"/>
-          </w:tcPr>
-          <w:p>
-            <w:pPr>
-              <w:rPr>
-                <w:rFonts w:ascii="Times New Roman" w:hAnsi="Times New Roman" w:cs="Times New Roman"/>
-                <w:sz w:val="20"/>
-                <w:szCs w:val="20"/>
-              </w:rPr>
-            </w:pPr>
-          </w:p>
-        </w:tc>
-      </w:tr>
-      <w:tr>
-        <w:trPr>
-          <w:trHeight w:val="525"/>
-        </w:trPr>
-        <w:tc>
-          <w:tcPr>
-            <w:tcW w:w="650" w:type="dxa"/>
-          </w:tcPr>
-          <w:p>
-            <w:pPr>
-              <w:jc w:val="center"/>
-              <w:rPr>
-                <w:rFonts w:ascii="Times New Roman" w:hAnsi="Times New Roman" w:cs="Times New Roman"/>
-                <w:sz w:val="20"/>
-                <w:szCs w:val="20"/>
-              </w:rPr>
-            </w:pPr>
-            <w:r>
-              <w:rPr>
-                <w:rFonts w:ascii="Times New Roman" w:hAnsi="Times New Roman" w:cs="Times New Roman"/>
-                <w:sz w:val="20"/>
-                <w:szCs w:val="20"/>
-              </w:rPr>
-              <w:t>7</w:t>
-            </w:r>
-          </w:p>
-        </w:tc>
-        <w:tc>
-          <w:tcPr>
-            <w:tcW w:w="3707" w:type="dxa"/>
-          </w:tcPr>
-          <w:p>
-            <w:pPr>
-              <w:rPr>
-                <w:rFonts w:ascii="Times New Roman" w:hAnsi="Times New Roman" w:cs="Times New Roman"/>
-                <w:sz w:val="20"/>
-                <w:szCs w:val="20"/>
-              </w:rPr>
-            </w:pPr>
-          </w:p>
-        </w:tc>
-        <w:tc>
-          <w:tcPr>
-            <w:tcW w:w="3127" w:type="dxa"/>
-          </w:tcPr>
-          <w:p>
-            <w:pPr>
-              <w:rPr>
-                <w:rFonts w:ascii="Times New Roman" w:hAnsi="Times New Roman" w:cs="Times New Roman"/>
-                <w:sz w:val="20"/>
-                <w:szCs w:val="20"/>
-              </w:rPr>
-            </w:pPr>
-          </w:p>
-        </w:tc>
-        <w:tc>
-          <w:tcPr>
-            <w:tcW w:w="3153" w:type="dxa"/>
-          </w:tcPr>
-          <w:p>
-            <w:pPr>
-              <w:rPr>
-                <w:rFonts w:ascii="Times New Roman" w:hAnsi="Times New Roman" w:cs="Times New Roman"/>
-                <w:sz w:val="20"/>
-                <w:szCs w:val="20"/>
-              </w:rPr>
-            </w:pPr>
-          </w:p>
-        </w:tc>
-      </w:tr>
-      <w:tr>
-        <w:trPr>
-          <w:trHeight w:val="525"/>
-        </w:trPr>
-        <w:tc>
-          <w:tcPr>
-            <w:tcW w:w="650" w:type="dxa"/>
-          </w:tcPr>
-          <w:p>
-            <w:pPr>
-              <w:jc w:val="center"/>
-              <w:rPr>
-                <w:rFonts w:ascii="Times New Roman" w:hAnsi="Times New Roman" w:cs="Times New Roman"/>
-                <w:sz w:val="20"/>
-                <w:szCs w:val="20"/>
-              </w:rPr>
-            </w:pPr>
-            <w:r>
-              <w:rPr>
-                <w:rFonts w:ascii="Times New Roman" w:hAnsi="Times New Roman" w:cs="Times New Roman"/>
-                <w:sz w:val="20"/>
-                <w:szCs w:val="20"/>
-              </w:rPr>
-              <w:t>8</w:t>
-            </w:r>
-          </w:p>
-        </w:tc>
-        <w:tc>
-          <w:tcPr>
-            <w:tcW w:w="3707" w:type="dxa"/>
-          </w:tcPr>
-          <w:p>
-            <w:pPr>
-              <w:rPr>
-                <w:rFonts w:ascii="Times New Roman" w:hAnsi="Times New Roman" w:cs="Times New Roman"/>
-                <w:sz w:val="20"/>
-                <w:szCs w:val="20"/>
-              </w:rPr>
-            </w:pPr>
-          </w:p>
-        </w:tc>
-        <w:tc>
-          <w:tcPr>
-            <w:tcW w:w="3127" w:type="dxa"/>
-          </w:tcPr>
-          <w:p>
-            <w:pPr>
-              <w:rPr>
-                <w:rFonts w:ascii="Times New Roman" w:hAnsi="Times New Roman" w:cs="Times New Roman"/>
-                <w:sz w:val="20"/>
-                <w:szCs w:val="20"/>
-              </w:rPr>
-            </w:pPr>
-          </w:p>
-        </w:tc>
-        <w:tc>
-          <w:tcPr>
-            <w:tcW w:w="3153" w:type="dxa"/>
-          </w:tcPr>
-          <w:p>
-            <w:pPr>
-              <w:rPr>
-                <w:rFonts w:ascii="Times New Roman" w:hAnsi="Times New Roman" w:cs="Times New Roman"/>
-                <w:sz w:val="20"/>
-                <w:szCs w:val="20"/>
-              </w:rPr>
-            </w:pPr>
-          </w:p>
-        </w:tc>
-      </w:tr>
-      <w:tr>
-        <w:trPr>
-          <w:trHeight w:val="525"/>
-        </w:trPr>
-        <w:tc>
-          <w:tcPr>
-            <w:tcW w:w="650" w:type="dxa"/>
-          </w:tcPr>
-          <w:p>
-            <w:pPr>
-              <w:jc w:val="center"/>
-              <w:rPr>
-                <w:rFonts w:ascii="Times New Roman" w:hAnsi="Times New Roman" w:cs="Times New Roman"/>
-                <w:sz w:val="20"/>
-                <w:szCs w:val="20"/>
-              </w:rPr>
-            </w:pPr>
-            <w:r>
-              <w:rPr>
-                <w:rFonts w:ascii="Times New Roman" w:hAnsi="Times New Roman" w:cs="Times New Roman"/>
-                <w:sz w:val="20"/>
-                <w:szCs w:val="20"/>
-              </w:rPr>
-              <w:t>9</w:t>
-            </w:r>
-          </w:p>
-        </w:tc>
-        <w:tc>
-          <w:tcPr>
-            <w:tcW w:w="3707" w:type="dxa"/>
-          </w:tcPr>
-          <w:p>
-            <w:pPr>
-              <w:rPr>
-                <w:rFonts w:ascii="Times New Roman" w:hAnsi="Times New Roman" w:cs="Times New Roman"/>
-                <w:sz w:val="20"/>
-                <w:szCs w:val="20"/>
-              </w:rPr>
-            </w:pPr>
-          </w:p>
-        </w:tc>
-        <w:tc>
-          <w:tcPr>
-            <w:tcW w:w="3127" w:type="dxa"/>
-          </w:tcPr>
-          <w:p>
-            <w:pPr>
-              <w:rPr>
-                <w:rFonts w:ascii="Times New Roman" w:hAnsi="Times New Roman" w:cs="Times New Roman"/>
-                <w:sz w:val="20"/>
-                <w:szCs w:val="20"/>
-              </w:rPr>
-            </w:pPr>
-          </w:p>
-        </w:tc>
-        <w:tc>
-          <w:tcPr>
-            <w:tcW w:w="3153" w:type="dxa"/>
-          </w:tcPr>
-          <w:p>
-            <w:pPr>
-              <w:rPr>
-                <w:rFonts w:ascii="Times New Roman" w:hAnsi="Times New Roman" w:cs="Times New Roman"/>
-                <w:sz w:val="20"/>
-                <w:szCs w:val="20"/>
-              </w:rPr>
-            </w:pPr>
-          </w:p>
-        </w:tc>
-      </w:tr>
-      <w:tr>
-        <w:trPr>
-          <w:trHeight w:val="525"/>
-        </w:trPr>
-        <w:tc>
-          <w:tcPr>
-            <w:tcW w:w="650" w:type="dxa"/>
-          </w:tcPr>
-          <w:p>
-            <w:pPr>
-              <w:jc w:val="center"/>
-              <w:rPr>
-                <w:rFonts w:ascii="Times New Roman" w:hAnsi="Times New Roman" w:cs="Times New Roman"/>
-                <w:sz w:val="20"/>
-                <w:szCs w:val="20"/>
-              </w:rPr>
-            </w:pPr>
-            <w:r>
-              <w:rPr>
-                <w:rFonts w:ascii="Times New Roman" w:hAnsi="Times New Roman" w:cs="Times New Roman"/>
-                <w:sz w:val="20"/>
-                <w:szCs w:val="20"/>
-              </w:rPr>
-              <w:t>10</w:t>
-            </w:r>
-            <w:bookmarkStart w:id="0" w:name="_GoBack"/>
-            <w:bookmarkEnd w:id="0"/>
-          </w:p>
-        </w:tc>
-        <w:tc>
-          <w:tcPr>
-            <w:tcW w:w="3707" w:type="dxa"/>
-          </w:tcPr>
-          <w:p>
-            <w:pPr>
-              <w:rPr>
-                <w:rFonts w:ascii="Times New Roman" w:hAnsi="Times New Roman" w:cs="Times New Roman"/>
-                <w:sz w:val="20"/>
-                <w:szCs w:val="20"/>
-              </w:rPr>
-            </w:pPr>
-          </w:p>
-        </w:tc>
-        <w:tc>
-          <w:tcPr>
-            <w:tcW w:w="3127" w:type="dxa"/>
-          </w:tcPr>
-          <w:p>
-            <w:pPr>
-              <w:rPr>
-                <w:rFonts w:ascii="Times New Roman" w:hAnsi="Times New Roman" w:cs="Times New Roman"/>
-                <w:sz w:val="20"/>
-                <w:szCs w:val="20"/>
-              </w:rPr>
-            </w:pPr>
-          </w:p>
-        </w:tc>
-        <w:tc>
-          <w:tcPr>
-            <w:tcW w:w="3153" w:type="dxa"/>
-          </w:tcPr>
-          <w:p>
-            <w:pPr>
-              <w:rPr>
-                <w:rFonts w:ascii="Times New Roman" w:hAnsi="Times New Roman" w:cs="Times New Roman"/>
-                <w:sz w:val="20"/>
-                <w:szCs w:val="20"/>
-              </w:rPr>
-            </w:pPr>
+            <w:r>
+              <w:t>{MonPhatSinh}{/MenuPhatSinh}</w:t>
+            </w:r>
           </w:p>
         </w:tc>
       </w:tr>

</xml_diff>